<commit_message>
feat(corpus): revamp PedalWorks kb-test into a 3-tier hierarchical corpus
Rewrites the synthetic PedalWorks corpus so extraction yields a clean, tiered knowledge graph (Tier 0 super-themes -> Tier 1 sub-nodes -> Tier 2 detail):
- item-first supplier names (Frames Ltd, Wheels Co, ...); dropped generic 'Bicycle'; Scheduler -> Planner
- new docs: architecture-flow, data-model, bom, production, fulfillment, planning_and_demand
- prose<->code twin kept; binaries regenerated with image/table probes preserved
- dropped Dockerfile/Makefile (were ingested as infra noise)

Co-Authored-By: Claude Opus 4.8 (1M context) <noreply@anthropic.com>
</commit_message>
<xml_diff>
--- a/docs/quality_checklist.docx
+++ b/docs/quality_checklist.docx
@@ -12,12 +12,12 @@
     </w:p>
     <w:p>
       <w:r>
-        <w:t>This checklist enumerates the gate criteria used at the Portland Assembly Floor's QC station before a City Cruiser or Trail Blazer is released to Shipping. Every inspection -- pass or fail -- consumes test material and posts a scrap cost to the Ledger.</w:t>
+        <w:t>This checklist enumerates the gate criteria used at the Quality station before a City Cruiser or Trail Blazer is released to Shipping. Every inspection -- pass or fail -- consumes test material and posts a scrap cost to the Ledger.</w:t>
       </w:r>
     </w:p>
     <w:p>
       <w:r>
-        <w:t>The first unit inspected in a run always undergoes a first-article inspection and always fails; it is returned to Assembly for rework and re-inspected before moving on.</w:t>
+        <w:t>The checks below always run in the same order, start to finish, for every unit. A unit failing any one of them is returned to Assembly for rework and re-enters the checklist from the top before it is allowed to ship.</w:t>
       </w:r>
     </w:p>
     <w:tbl>
@@ -48,7 +48,7 @@
           </w:tcPr>
           <w:p>
             <w:r>
-              <w:t>Applies To</w:t>
+              <w:t>Step</w:t>
             </w:r>
           </w:p>
         </w:tc>
@@ -80,7 +80,7 @@
           </w:tcPr>
           <w:p>
             <w:r>
-              <w:t>Frame weld integrity</w:t>
+              <w:t>First-Article Inspection</w:t>
             </w:r>
           </w:p>
         </w:tc>
@@ -90,7 +90,49 @@
           </w:tcPr>
           <w:p>
             <w:r>
-              <w:t>City Cruiser, Trail Blazer</w:t>
+              <w:t>1</w:t>
+            </w:r>
+          </w:p>
+        </w:tc>
+        <w:tc>
+          <w:tcPr>
+            <w:tcW w:type="dxa" w:w="2160"/>
+          </w:tcPr>
+          <w:p>
+            <w:r>
+              <w:t>First unit of every run</w:t>
+            </w:r>
+          </w:p>
+        </w:tc>
+        <w:tc>
+          <w:tcPr>
+            <w:tcW w:type="dxa" w:w="2160"/>
+          </w:tcPr>
+          <w:p>
+            <w:r>
+              <w:t>Always fails by design; routed to rework</w:t>
+            </w:r>
+          </w:p>
+        </w:tc>
+      </w:tr>
+      <w:tr>
+        <w:tc>
+          <w:tcPr>
+            <w:tcW w:type="dxa" w:w="2160"/>
+          </w:tcPr>
+          <w:p>
+            <w:r>
+              <w:t>Weld Test</w:t>
+            </w:r>
+          </w:p>
+        </w:tc>
+        <w:tc>
+          <w:tcPr>
+            <w:tcW w:type="dxa" w:w="2160"/>
+          </w:tcPr>
+          <w:p>
+            <w:r>
+              <w:t>2</w:t>
             </w:r>
           </w:p>
         </w:tc>
@@ -122,7 +164,7 @@
           </w:tcPr>
           <w:p>
             <w:r>
-              <w:t>Wheelset trueness</w:t>
+              <w:t>Brake Test</w:t>
             </w:r>
           </w:p>
         </w:tc>
@@ -132,7 +174,7 @@
           </w:tcPr>
           <w:p>
             <w:r>
-              <w:t>City Cruiser, Trail Blazer</w:t>
+              <w:t>3</w:t>
             </w:r>
           </w:p>
         </w:tc>
@@ -142,91 +184,7 @@
           </w:tcPr>
           <w:p>
             <w:r>
-              <w:t>Lateral runout</w:t>
-            </w:r>
-          </w:p>
-        </w:tc>
-        <w:tc>
-          <w:tcPr>
-            <w:tcW w:type="dxa" w:w="2160"/>
-          </w:tcPr>
-          <w:p>
-            <w:r>
-              <w:t>&lt;= 0.5 mm</w:t>
-            </w:r>
-          </w:p>
-        </w:tc>
-      </w:tr>
-      <w:tr>
-        <w:tc>
-          <w:tcPr>
-            <w:tcW w:type="dxa" w:w="2160"/>
-          </w:tcPr>
-          <w:p>
-            <w:r>
-              <w:t>Drivetrain shift index</w:t>
-            </w:r>
-          </w:p>
-        </w:tc>
-        <w:tc>
-          <w:tcPr>
-            <w:tcW w:type="dxa" w:w="2160"/>
-          </w:tcPr>
-          <w:p>
-            <w:r>
-              <w:t>City Cruiser</w:t>
-            </w:r>
-          </w:p>
-        </w:tc>
-        <w:tc>
-          <w:tcPr>
-            <w:tcW w:type="dxa" w:w="2160"/>
-          </w:tcPr>
-          <w:p>
-            <w:r>
-              <w:t>10-speed indexed shift</w:t>
-            </w:r>
-          </w:p>
-        </w:tc>
-        <w:tc>
-          <w:tcPr>
-            <w:tcW w:type="dxa" w:w="2160"/>
-          </w:tcPr>
-          <w:p>
-            <w:r>
-              <w:t>All gears engage cleanly</w:t>
-            </w:r>
-          </w:p>
-        </w:tc>
-      </w:tr>
-      <w:tr>
-        <w:tc>
-          <w:tcPr>
-            <w:tcW w:type="dxa" w:w="2160"/>
-          </w:tcPr>
-          <w:p>
-            <w:r>
-              <w:t>Brake Set pull test</w:t>
-            </w:r>
-          </w:p>
-        </w:tc>
-        <w:tc>
-          <w:tcPr>
-            <w:tcW w:type="dxa" w:w="2160"/>
-          </w:tcPr>
-          <w:p>
-            <w:r>
-              <w:t>City Cruiser</w:t>
-            </w:r>
-          </w:p>
-        </w:tc>
-        <w:tc>
-          <w:tcPr>
-            <w:tcW w:type="dxa" w:w="2160"/>
-          </w:tcPr>
-          <w:p>
-            <w:r>
-              <w:t>Lever force</w:t>
+              <w:t>Lever force test</w:t>
             </w:r>
           </w:p>
         </w:tc>
@@ -248,7 +206,7 @@
           </w:tcPr>
           <w:p>
             <w:r>
-              <w:t>Suspension Fork travel test</w:t>
+              <w:t>Wheel-Alignment Check</w:t>
             </w:r>
           </w:p>
         </w:tc>
@@ -258,7 +216,7 @@
           </w:tcPr>
           <w:p>
             <w:r>
-              <w:t>Trail Blazer</w:t>
+              <w:t>4</w:t>
             </w:r>
           </w:p>
         </w:tc>
@@ -268,7 +226,7 @@
           </w:tcPr>
           <w:p>
             <w:r>
-              <w:t>Compression/rebound</w:t>
+              <w:t>Lateral runout</w:t>
             </w:r>
           </w:p>
         </w:tc>
@@ -278,7 +236,7 @@
           </w:tcPr>
           <w:p>
             <w:r>
-              <w:t>Full 120 mm travel</w:t>
+              <w:t>&lt;= 0.5 mm</w:t>
             </w:r>
           </w:p>
         </w:tc>

</xml_diff>